<commit_message>
feat(saff-study): publish specification and test suite v2.4
</commit_message>
<xml_diff>
--- a/output/docx/DelecaoExtracoes.docx
+++ b/output/docx/DelecaoExtracoes.docx
@@ -88,7 +88,7 @@
         <w:rPr>
           <w:sz w:val="20"/>
         </w:rPr>
-        <w:t>Usuario deve estar logado no servidor e extrator como administrador ; 705 extracoes ja foram realizadas (pasta “EXTRACT_FILE_IPP320_AKIRA”)</w:t>
+        <w:t>Usuário deve estar logado no servidor e extrator como administrador ; 705 extrações já realizadas (pasta “EXTRACT_FILE_IPP320_AKIRA”)</w:t>
       </w:r>
     </w:p>
     <w:p>
@@ -197,17 +197,17 @@
               <w:rPr>
                 <w:sz w:val="18"/>
               </w:rPr>
-              <w:t>administrador: seleciona o check box referente a extracao referente ao numero serial 12311PP30154516”</w:t>
-            </w:r>
-          </w:p>
-        </w:tc>
-        <w:tc>
-          <w:p>
-            <w:r>
-              <w:rPr>
-                <w:sz w:val="18"/>
-              </w:rPr>
-              <w:t>SYSTEM marca selecao com um tick</w:t>
+              <w:t>administrador: seleciona o check box referente a extração referente ao número serial 12311PP30154516”</w:t>
+            </w:r>
+          </w:p>
+        </w:tc>
+        <w:tc>
+          <w:p>
+            <w:r>
+              <w:rPr>
+                <w:sz w:val="18"/>
+              </w:rPr>
+              <w:t>SYSTEM marca seleção com um tick</w:t>
             </w:r>
           </w:p>
         </w:tc>
@@ -229,17 +229,17 @@
               <w:rPr>
                 <w:sz w:val="18"/>
               </w:rPr>
-              <w:t>administrador: pressiona o botao “Delete extractions”</w:t>
-            </w:r>
-          </w:p>
-        </w:tc>
-        <w:tc>
-          <w:p>
-            <w:r>
-              <w:rPr>
-                <w:sz w:val="18"/>
-              </w:rPr>
-              <w:t>SYSTEM exibe uma mensagem pop-up solicitando a confirmação da delecao</w:t>
+              <w:t>administrador: pressiona o botão “Delete extractions”</w:t>
+            </w:r>
+          </w:p>
+        </w:tc>
+        <w:tc>
+          <w:p>
+            <w:r>
+              <w:rPr>
+                <w:sz w:val="18"/>
+              </w:rPr>
+              <w:t>SYSTEM exibe uma mensagem pop-up solicitando a confirmação da deleção</w:t>
             </w:r>
           </w:p>
         </w:tc>
@@ -261,17 +261,17 @@
               <w:rPr>
                 <w:sz w:val="18"/>
               </w:rPr>
-              <w:t>administrador: confirma delecao</w:t>
-            </w:r>
-          </w:p>
-        </w:tc>
-        <w:tc>
-          <w:p>
-            <w:r>
-              <w:rPr>
-                <w:sz w:val="18"/>
-              </w:rPr>
-              <w:t>SYSTEM exibe a lista de extracoes com 704 entradas</w:t>
+              <w:t>administrador: confirma deleção</w:t>
+            </w:r>
+          </w:p>
+        </w:tc>
+        <w:tc>
+          <w:p>
+            <w:r>
+              <w:rPr>
+                <w:sz w:val="18"/>
+              </w:rPr>
+              <w:t>SYSTEM exibe a lista de extrações com 704 entradas</w:t>
             </w:r>
           </w:p>
         </w:tc>
@@ -292,7 +292,7 @@
           <w:sz w:val="24"/>
           <w:color w:val="2B6CB0"/>
         </w:rPr>
-        <w:t>[TC2] Alternative Flow 1: Cancela delecao</w:t>
+        <w:t>[TC2] Alternative Flow 1: Cancela deleção</w:t>
       </w:r>
     </w:p>
     <w:p>
@@ -310,7 +310,7 @@
         <w:rPr>
           <w:sz w:val="20"/>
         </w:rPr>
-        <w:t>Usuario deve estar logado no servidor e extrator como administrador ; 705 extracoes ja foram realizadas (pasta “EXTRACT_FILE_IPP320_AKIRA”)</w:t>
+        <w:t>Usuário deve estar logado no servidor e extrator como administrador ; 705 extrações já realizadas (pasta “EXTRACT_FILE_IPP320_AKIRA”)</w:t>
       </w:r>
     </w:p>
     <w:p>
@@ -419,17 +419,17 @@
               <w:rPr>
                 <w:sz w:val="18"/>
               </w:rPr>
-              <w:t>administrador: seleciona o check box referente a extracao referente ao numero serial 12311PP30154516”</w:t>
-            </w:r>
-          </w:p>
-        </w:tc>
-        <w:tc>
-          <w:p>
-            <w:r>
-              <w:rPr>
-                <w:sz w:val="18"/>
-              </w:rPr>
-              <w:t>SYSTEM marca selecao com um tick</w:t>
+              <w:t>administrador: seleciona o check box referente a extração referente ao número serial 12311PP30154516”</w:t>
+            </w:r>
+          </w:p>
+        </w:tc>
+        <w:tc>
+          <w:p>
+            <w:r>
+              <w:rPr>
+                <w:sz w:val="18"/>
+              </w:rPr>
+              <w:t>SYSTEM marca seleção com um tick</w:t>
             </w:r>
           </w:p>
         </w:tc>
@@ -451,17 +451,17 @@
               <w:rPr>
                 <w:sz w:val="18"/>
               </w:rPr>
-              <w:t>administrador: pressiona o botao “Delete extractions”</w:t>
-            </w:r>
-          </w:p>
-        </w:tc>
-        <w:tc>
-          <w:p>
-            <w:r>
-              <w:rPr>
-                <w:sz w:val="18"/>
-              </w:rPr>
-              <w:t>SYSTEM exibe uma mensagem pop-up solicitando a confirmação da delecao</w:t>
+              <w:t>administrador: pressiona o botão “Delete extractions”</w:t>
+            </w:r>
+          </w:p>
+        </w:tc>
+        <w:tc>
+          <w:p>
+            <w:r>
+              <w:rPr>
+                <w:sz w:val="18"/>
+              </w:rPr>
+              <w:t>SYSTEM exibe uma mensagem pop-up solicitando a confirmação da deleção</w:t>
             </w:r>
           </w:p>
         </w:tc>
@@ -483,7 +483,7 @@
               <w:rPr>
                 <w:sz w:val="18"/>
               </w:rPr>
-              <w:t>administrador: cancela delecao</w:t>
+              <w:t>administrador: cancela deleção</w:t>
             </w:r>
           </w:p>
         </w:tc>
@@ -515,17 +515,17 @@
               <w:rPr>
                 <w:sz w:val="18"/>
               </w:rPr>
-              <w:t>administrador: seleciona o check box referente a extracao referente ao numero serial 12311PP30154516”</w:t>
-            </w:r>
-          </w:p>
-        </w:tc>
-        <w:tc>
-          <w:p>
-            <w:r>
-              <w:rPr>
-                <w:sz w:val="18"/>
-              </w:rPr>
-              <w:t>SYSTEM marca selecao com um tick</w:t>
+              <w:t>administrador: seleciona o check box referente a extração referente ao número serial 12311PP30154516”</w:t>
+            </w:r>
+          </w:p>
+        </w:tc>
+        <w:tc>
+          <w:p>
+            <w:r>
+              <w:rPr>
+                <w:sz w:val="18"/>
+              </w:rPr>
+              <w:t>SYSTEM marca seleção com um tick</w:t>
             </w:r>
           </w:p>
         </w:tc>
@@ -547,17 +547,17 @@
               <w:rPr>
                 <w:sz w:val="18"/>
               </w:rPr>
-              <w:t>administrador: pressiona o botao “Delete extractions”</w:t>
-            </w:r>
-          </w:p>
-        </w:tc>
-        <w:tc>
-          <w:p>
-            <w:r>
-              <w:rPr>
-                <w:sz w:val="18"/>
-              </w:rPr>
-              <w:t>SYSTEM exibe uma mensagem pop-up solicitando a confirmação da delecao</w:t>
+              <w:t>administrador: pressiona o botão “Delete extractions”</w:t>
+            </w:r>
+          </w:p>
+        </w:tc>
+        <w:tc>
+          <w:p>
+            <w:r>
+              <w:rPr>
+                <w:sz w:val="18"/>
+              </w:rPr>
+              <w:t>SYSTEM exibe uma mensagem pop-up solicitando a confirmação da deleção</w:t>
             </w:r>
           </w:p>
         </w:tc>
@@ -579,17 +579,17 @@
               <w:rPr>
                 <w:sz w:val="18"/>
               </w:rPr>
-              <w:t>administrador: confirma delecao</w:t>
-            </w:r>
-          </w:p>
-        </w:tc>
-        <w:tc>
-          <w:p>
-            <w:r>
-              <w:rPr>
-                <w:sz w:val="18"/>
-              </w:rPr>
-              <w:t>SYSTEM exibe a lista de extracoes com 704 entradas</w:t>
+              <w:t>administrador: confirma deleção</w:t>
+            </w:r>
+          </w:p>
+        </w:tc>
+        <w:tc>
+          <w:p>
+            <w:r>
+              <w:rPr>
+                <w:sz w:val="18"/>
+              </w:rPr>
+              <w:t>SYSTEM exibe a lista de extrações com 704 entradas</w:t>
             </w:r>
           </w:p>
         </w:tc>
@@ -610,7 +610,7 @@
           <w:sz w:val="24"/>
           <w:color w:val="2B6CB0"/>
         </w:rPr>
-        <w:t>[TC3] Alternative Flow 2: Realiza Filtro e delecao</w:t>
+        <w:t>[TC3] Alternative Flow 2: Realiza Filtro e deleção</w:t>
       </w:r>
     </w:p>
     <w:p>
@@ -628,7 +628,7 @@
         <w:rPr>
           <w:sz w:val="20"/>
         </w:rPr>
-        <w:t>Usuario deve estar logado no servidor e extrator como administrador ; 705 extracoes ja foram realizadas (pasta “EXTRACT_FILE_IPP320_AKIRA”)</w:t>
+        <w:t>Usuário deve estar logado no servidor e extrator como administrador ; 705 extrações já realizadas (pasta “EXTRACT_FILE_IPP320_AKIRA”)</w:t>
       </w:r>
     </w:p>
     <w:p>
@@ -747,7 +747,7 @@
               <w:rPr>
                 <w:sz w:val="18"/>
               </w:rPr>
-              <w:t>SYSTEM exibe opcoes “Activated”, “Alert Interruption”, “Deactivated”, “Mockup” e “Error”</w:t>
+              <w:t>SYSTEM exibe opções “Activated”, “Alert Interruption”, “Deactivated”, “Mockup” e “Error”</w:t>
             </w:r>
           </w:p>
         </w:tc>
@@ -769,17 +769,17 @@
               <w:rPr>
                 <w:sz w:val="18"/>
               </w:rPr>
-              <w:t>administrador: seleciona opcao “Activated” no campo de filtro “State”</w:t>
-            </w:r>
-          </w:p>
-        </w:tc>
-        <w:tc>
-          <w:p>
-            <w:r>
-              <w:rPr>
-                <w:sz w:val="18"/>
-              </w:rPr>
-              <w:t>SYSTEM atualiza pagina mostrando 608 extracoes</w:t>
+              <w:t>administrador: seleciona opção “Activated” no campo de filtro “State”</w:t>
+            </w:r>
+          </w:p>
+        </w:tc>
+        <w:tc>
+          <w:p>
+            <w:r>
+              <w:rPr>
+                <w:sz w:val="18"/>
+              </w:rPr>
+              <w:t>SYSTEM atualiza página mostrando 608 extrações</w:t>
             </w:r>
           </w:p>
         </w:tc>
@@ -801,17 +801,17 @@
               <w:rPr>
                 <w:sz w:val="18"/>
               </w:rPr>
-              <w:t>administrador: seleciona o check box que marca todas extracoes para delecao</w:t>
-            </w:r>
-          </w:p>
-        </w:tc>
-        <w:tc>
-          <w:p>
-            <w:r>
-              <w:rPr>
-                <w:sz w:val="18"/>
-              </w:rPr>
-              <w:t>SYSTEM marca todas extracoes após o filtro com um tick</w:t>
+              <w:t>administrador: seleciona o check box que marca todas extrações para deleção</w:t>
+            </w:r>
+          </w:p>
+        </w:tc>
+        <w:tc>
+          <w:p>
+            <w:r>
+              <w:rPr>
+                <w:sz w:val="18"/>
+              </w:rPr>
+              <w:t>SYSTEM marca todas extrações após o filtro com um tick</w:t>
             </w:r>
           </w:p>
         </w:tc>
@@ -833,17 +833,17 @@
               <w:rPr>
                 <w:sz w:val="18"/>
               </w:rPr>
-              <w:t>administrador: pressiona o botao “Delete extractions”</w:t>
-            </w:r>
-          </w:p>
-        </w:tc>
-        <w:tc>
-          <w:p>
-            <w:r>
-              <w:rPr>
-                <w:sz w:val="18"/>
-              </w:rPr>
-              <w:t>SYSTEM exibe uma mensagem pop-up solicitando a confirmacao da delecao</w:t>
+              <w:t>administrador: pressiona o botão “Delete extractions”</w:t>
+            </w:r>
+          </w:p>
+        </w:tc>
+        <w:tc>
+          <w:p>
+            <w:r>
+              <w:rPr>
+                <w:sz w:val="18"/>
+              </w:rPr>
+              <w:t>SYSTEM exibe uma mensagem pop-up solicitando a confirmação da deleção</w:t>
             </w:r>
           </w:p>
         </w:tc>
@@ -865,17 +865,17 @@
               <w:rPr>
                 <w:sz w:val="18"/>
               </w:rPr>
-              <w:t>administrador: confirma delecao</w:t>
-            </w:r>
-          </w:p>
-        </w:tc>
-        <w:tc>
-          <w:p>
-            <w:r>
-              <w:rPr>
-                <w:sz w:val="18"/>
-              </w:rPr>
-              <w:t>SYSTEM exibe a lista de extracoes com 96 entradas</w:t>
+              <w:t>administrador: confirma deleção</w:t>
+            </w:r>
+          </w:p>
+        </w:tc>
+        <w:tc>
+          <w:p>
+            <w:r>
+              <w:rPr>
+                <w:sz w:val="18"/>
+              </w:rPr>
+              <w:t>SYSTEM exibe a lista de extrações com 96 entradas</w:t>
             </w:r>
           </w:p>
         </w:tc>
@@ -896,7 +896,7 @@
           <w:sz w:val="24"/>
           <w:color w:val="2B6CB0"/>
         </w:rPr>
-        <w:t>[TC4] Alternative Flow 3: Deleta todas extracoes</w:t>
+        <w:t>[TC4] Alternative Flow 3: Deleta todas extrações</w:t>
       </w:r>
     </w:p>
     <w:p>
@@ -914,7 +914,7 @@
         <w:rPr>
           <w:sz w:val="20"/>
         </w:rPr>
-        <w:t>Usuario deve estar logado no servidor e extrator como administrador ; 705 extracoes ja foram realizadas (pasta “EXTRACT_FILE_IPP320_AKIRA”)</w:t>
+        <w:t>Usuário deve estar logado no servidor e extrator como administrador ; 705 extrações já realizadas (pasta “EXTRACT_FILE_IPP320_AKIRA”)</w:t>
       </w:r>
     </w:p>
     <w:p>
@@ -1023,7 +1023,7 @@
               <w:rPr>
                 <w:sz w:val="18"/>
               </w:rPr>
-              <w:t>administrador: seleciona o check box que marca todas extracoes para delecao</w:t>
+              <w:t>administrador: seleciona o check box que marca todas extrações para deleção</w:t>
             </w:r>
           </w:p>
         </w:tc>
@@ -1055,17 +1055,17 @@
               <w:rPr>
                 <w:sz w:val="18"/>
               </w:rPr>
-              <w:t>administrador: pressiona o botao “Delete extractions”</w:t>
-            </w:r>
-          </w:p>
-        </w:tc>
-        <w:tc>
-          <w:p>
-            <w:r>
-              <w:rPr>
-                <w:sz w:val="18"/>
-              </w:rPr>
-              <w:t>SYSTEM exibe uma mensagem pop-up indicando que nao existem extracoes para serem deletadas</w:t>
+              <w:t>administrador: pressiona o botão “Delete extractions”</w:t>
+            </w:r>
+          </w:p>
+        </w:tc>
+        <w:tc>
+          <w:p>
+            <w:r>
+              <w:rPr>
+                <w:sz w:val="18"/>
+              </w:rPr>
+              <w:t>SYSTEM exibe uma mensagem pop-up indicando que não existem extrações para serem deletadas</w:t>
             </w:r>
           </w:p>
         </w:tc>

</xml_diff>